<commit_message>
grants: drafts of past grant submissions
</commit_message>
<xml_diff>
--- a/grants/SmallGrant2026/SmallGrant_D6.docx
+++ b/grants/SmallGrant2026/SmallGrant_D6.docx
@@ -99,6 +99,7 @@
         <w:jc w:val="both"/>
         <w:rPr>
           <w:rFonts w:ascii="Arial" w:hAnsi="Arial" w:cs="Arial"/>
+          <w:u w:val="single"/>
           <w:lang w:val="en-US"/>
         </w:rPr>
       </w:pPr>
@@ -838,6 +839,7 @@
       <w:r>
         <w:rPr>
           <w:rFonts w:ascii="Arial" w:hAnsi="Arial" w:cs="Arial"/>
+          <w:noProof/>
           <w:lang w:val="en-US"/>
         </w:rPr>
         <w:drawing>
@@ -4147,6 +4149,7 @@
       <w:r>
         <w:rPr>
           <w:rFonts w:ascii="Arial" w:hAnsi="Arial" w:cs="Arial"/>
+          <w:lang w:val="en-US"/>
         </w:rPr>
         <w:t xml:space="preserve">&amp; Dey, A. (2022). </w:t>
       </w:r>
@@ -4902,6 +4905,7 @@
           <w:bCs/>
           <w:sz w:val="28"/>
           <w:szCs w:val="28"/>
+          <w:u w:val="single"/>
           <w:lang w:val="en-US"/>
         </w:rPr>
       </w:pPr>
@@ -4987,7 +4991,55 @@
           <w:u w:val="single"/>
           <w:lang w:val="en-US"/>
         </w:rPr>
-        <w:t>To Be Named (TBN), Graduate Student (effort: 2 summer months)</w:t>
+        <w:t>To Be Named (TBN), Graduate Student (</w:t>
+      </w:r>
+      <w:r>
+        <w:rPr>
+          <w:rFonts w:ascii="Arial" w:hAnsi="Arial" w:cs="Arial"/>
+          <w:u w:val="single"/>
+          <w:lang w:val="en-US"/>
+        </w:rPr>
+        <w:t xml:space="preserve">50% </w:t>
+      </w:r>
+      <w:r>
+        <w:rPr>
+          <w:rFonts w:ascii="Arial" w:hAnsi="Arial" w:cs="Arial"/>
+          <w:u w:val="single"/>
+          <w:lang w:val="en-US"/>
+        </w:rPr>
+        <w:t>effort</w:t>
+      </w:r>
+      <w:r>
+        <w:rPr>
+          <w:rFonts w:ascii="Arial" w:hAnsi="Arial" w:cs="Arial"/>
+          <w:u w:val="single"/>
+          <w:lang w:val="en-US"/>
+        </w:rPr>
+        <w:t xml:space="preserve"> for</w:t>
+      </w:r>
+      <w:r>
+        <w:rPr>
+          <w:rFonts w:ascii="Arial" w:hAnsi="Arial" w:cs="Arial"/>
+          <w:u w:val="single"/>
+          <w:lang w:val="en-US"/>
+        </w:rPr>
+        <w:t xml:space="preserve"> </w:t>
+      </w:r>
+      <w:r>
+        <w:rPr>
+          <w:rFonts w:ascii="Arial" w:hAnsi="Arial" w:cs="Arial"/>
+          <w:u w:val="single"/>
+          <w:lang w:val="en-US"/>
+        </w:rPr>
+        <w:t>3</w:t>
+      </w:r>
+      <w:r>
+        <w:rPr>
+          <w:rFonts w:ascii="Arial" w:hAnsi="Arial" w:cs="Arial"/>
+          <w:u w:val="single"/>
+          <w:lang w:val="en-US"/>
+        </w:rPr>
+        <w:t xml:space="preserve"> summer months)</w:t>
       </w:r>
       <w:r>
         <w:rPr>
@@ -5025,7 +5077,28 @@
           <w:rFonts w:ascii="Arial" w:hAnsi="Arial" w:cs="Arial"/>
           <w:lang w:val="en-US"/>
         </w:rPr>
-        <w:t xml:space="preserve"> implementation and evaluation of the MOD-VAR test</w:t>
+        <w:t xml:space="preserve"> implementation and evaluation of the MOD-VAR </w:t>
+      </w:r>
+      <w:r>
+        <w:rPr>
+          <w:rFonts w:ascii="Arial" w:hAnsi="Arial" w:cs="Arial"/>
+          <w:lang w:val="en-US"/>
+        </w:rPr>
+        <w:t xml:space="preserve">hypothesis </w:t>
+      </w:r>
+      <w:r>
+        <w:rPr>
+          <w:rFonts w:ascii="Arial" w:hAnsi="Arial" w:cs="Arial"/>
+          <w:lang w:val="en-US"/>
+        </w:rPr>
+        <w:t>test</w:t>
+      </w:r>
+      <w:r>
+        <w:rPr>
+          <w:rFonts w:ascii="Arial" w:hAnsi="Arial" w:cs="Arial"/>
+          <w:lang w:val="en-US"/>
+        </w:rPr>
+        <w:t>ing procedure</w:t>
       </w:r>
       <w:r>
         <w:rPr>
@@ -5055,6 +5128,7 @@
           <w:rFonts w:ascii="Arial" w:hAnsi="Arial" w:cs="Arial"/>
           <w:b/>
           <w:bCs/>
+          <w:u w:val="single"/>
           <w:lang w:val="en-US"/>
         </w:rPr>
         <w:t>GSR 1</w:t>
@@ -5064,6 +5138,7 @@
           <w:rFonts w:ascii="Arial" w:hAnsi="Arial" w:cs="Arial"/>
           <w:b/>
           <w:bCs/>
+          <w:u w:val="single"/>
           <w:vertAlign w:val="superscript"/>
           <w:lang w:val="en-US"/>
         </w:rPr>
@@ -5074,108 +5149,60 @@
           <w:rFonts w:ascii="Arial" w:hAnsi="Arial" w:cs="Arial"/>
           <w:b/>
           <w:bCs/>
-          <w:lang w:val="en-US"/>
-        </w:rPr>
-        <w:t xml:space="preserve"> </w:t>
+          <w:u w:val="single"/>
+          <w:lang w:val="en-US"/>
+        </w:rPr>
+        <w:t xml:space="preserve"> month of</w:t>
       </w:r>
       <w:r>
         <w:rPr>
           <w:rFonts w:ascii="Arial" w:hAnsi="Arial" w:cs="Arial"/>
           <w:b/>
           <w:bCs/>
-          <w:lang w:val="en-US"/>
-        </w:rPr>
-        <w:t>month of</w:t>
+          <w:u w:val="single"/>
+          <w:lang w:val="en-US"/>
+        </w:rPr>
+        <w:t xml:space="preserve"> 50%</w:t>
       </w:r>
       <w:r>
         <w:rPr>
           <w:rFonts w:ascii="Arial" w:hAnsi="Arial" w:cs="Arial"/>
           <w:b/>
           <w:bCs/>
-          <w:lang w:val="en-US"/>
-        </w:rPr>
-        <w:t xml:space="preserve"> 50%</w:t>
+          <w:u w:val="single"/>
+          <w:lang w:val="en-US"/>
+        </w:rPr>
+        <w:t xml:space="preserve"> </w:t>
       </w:r>
       <w:r>
         <w:rPr>
           <w:rFonts w:ascii="Arial" w:hAnsi="Arial" w:cs="Arial"/>
           <w:b/>
           <w:bCs/>
-          <w:lang w:val="en-US"/>
-        </w:rPr>
-        <w:t xml:space="preserve"> </w:t>
+          <w:u w:val="single"/>
+          <w:lang w:val="en-US"/>
+        </w:rPr>
+        <w:t>summer effort ($3,</w:t>
       </w:r>
       <w:r>
         <w:rPr>
           <w:rFonts w:ascii="Arial" w:hAnsi="Arial" w:cs="Arial"/>
           <w:b/>
           <w:bCs/>
-          <w:lang w:val="en-US"/>
-        </w:rPr>
-        <w:t>summer effort</w:t>
+          <w:u w:val="single"/>
+          <w:lang w:val="en-US"/>
+        </w:rPr>
+        <w:t>629</w:t>
       </w:r>
       <w:r>
         <w:rPr>
           <w:rFonts w:ascii="Arial" w:hAnsi="Arial" w:cs="Arial"/>
           <w:b/>
           <w:bCs/>
-          <w:lang w:val="en-US"/>
-        </w:rPr>
-        <w:t xml:space="preserve"> (</w:t>
-      </w:r>
-      <w:r>
-        <w:rPr>
-          <w:rFonts w:ascii="Arial" w:hAnsi="Arial" w:cs="Arial"/>
-          <w:b/>
-          <w:bCs/>
-          <w:lang w:val="en-US"/>
-        </w:rPr>
-        <w:t>$</w:t>
-      </w:r>
-      <w:r>
-        <w:rPr>
-          <w:rFonts w:ascii="Arial" w:hAnsi="Arial" w:cs="Arial"/>
-          <w:b/>
-          <w:bCs/>
-          <w:lang w:val="en-US"/>
-        </w:rPr>
-        <w:t>3</w:t>
-      </w:r>
-      <w:r>
-        <w:rPr>
-          <w:rFonts w:ascii="Arial" w:hAnsi="Arial" w:cs="Arial"/>
-          <w:b/>
-          <w:bCs/>
-          <w:lang w:val="en-US"/>
-        </w:rPr>
-        <w:t>,</w:t>
-      </w:r>
-      <w:r>
-        <w:rPr>
-          <w:rFonts w:ascii="Arial" w:hAnsi="Arial" w:cs="Arial"/>
-          <w:b/>
-          <w:bCs/>
-          <w:lang w:val="en-US"/>
-        </w:rPr>
-        <w:t>629</w:t>
-      </w:r>
-      <w:r>
-        <w:rPr>
-          <w:rFonts w:ascii="Arial" w:hAnsi="Arial" w:cs="Arial"/>
-          <w:b/>
-          <w:bCs/>
-          <w:lang w:val="en-US"/>
-        </w:rPr>
-        <w:t xml:space="preserve"> USD</w:t>
-      </w:r>
-      <w:r>
-        <w:rPr>
-          <w:rFonts w:ascii="Arial" w:hAnsi="Arial" w:cs="Arial"/>
-          <w:b/>
-          <w:bCs/>
-          <w:lang w:val="en-US"/>
-        </w:rPr>
-        <w:t>):</w:t>
+          <w:u w:val="single"/>
+          <w:lang w:val="en-US"/>
+        </w:rPr>
+        <w:t xml:space="preserve"> USD):</w:t>
       </w:r>
       <w:r>
         <w:rPr>
@@ -5189,7 +5216,21 @@
           <w:rFonts w:ascii="Arial" w:hAnsi="Arial" w:cs="Arial"/>
           <w:lang w:val="en-US"/>
         </w:rPr>
-        <w:t>n coordination with the P.I., the method for testing moderator effects on behavioral networks, in accordance with Aim [A1].</w:t>
+        <w:t>n coordination with the P.I.</w:t>
+      </w:r>
+      <w:r>
+        <w:rPr>
+          <w:rFonts w:ascii="Arial" w:hAnsi="Arial" w:cs="Arial"/>
+          <w:lang w:val="en-US"/>
+        </w:rPr>
+        <w:t xml:space="preserve"> and co-PI</w:t>
+      </w:r>
+      <w:r>
+        <w:rPr>
+          <w:rFonts w:ascii="Arial" w:hAnsi="Arial" w:cs="Arial"/>
+          <w:lang w:val="en-US"/>
+        </w:rPr>
+        <w:t>, the method for testing moderator effects on behavioral networks, in accordance with Aim [A1].</w:t>
       </w:r>
     </w:p>
     <w:p>
@@ -5210,115 +5251,88 @@
           <w:rFonts w:ascii="Arial" w:hAnsi="Arial" w:cs="Arial"/>
           <w:b/>
           <w:bCs/>
-          <w:lang w:val="en-US"/>
-        </w:rPr>
-        <w:t xml:space="preserve">GSR </w:t>
+          <w:u w:val="single"/>
+          <w:lang w:val="en-US"/>
+        </w:rPr>
+        <w:t>GSR 2</w:t>
       </w:r>
       <w:r>
         <w:rPr>
           <w:rFonts w:ascii="Arial" w:hAnsi="Arial" w:cs="Arial"/>
           <w:b/>
           <w:bCs/>
-          <w:lang w:val="en-US"/>
-        </w:rPr>
-        <w:t>2</w:t>
+          <w:u w:val="single"/>
+          <w:vertAlign w:val="superscript"/>
+          <w:lang w:val="en-US"/>
+        </w:rPr>
+        <w:t>nd</w:t>
       </w:r>
       <w:r>
         <w:rPr>
           <w:rFonts w:ascii="Arial" w:hAnsi="Arial" w:cs="Arial"/>
           <w:b/>
           <w:bCs/>
-          <w:vertAlign w:val="superscript"/>
-          <w:lang w:val="en-US"/>
-        </w:rPr>
-        <w:t>nd</w:t>
+          <w:u w:val="single"/>
+          <w:lang w:val="en-US"/>
+        </w:rPr>
+        <w:t xml:space="preserve"> month </w:t>
       </w:r>
       <w:r>
         <w:rPr>
           <w:rFonts w:ascii="Arial" w:hAnsi="Arial" w:cs="Arial"/>
           <w:b/>
           <w:bCs/>
-          <w:lang w:val="en-US"/>
-        </w:rPr>
-        <w:t xml:space="preserve"> month </w:t>
+          <w:u w:val="single"/>
+          <w:lang w:val="en-US"/>
+        </w:rPr>
+        <w:t>of</w:t>
       </w:r>
       <w:r>
         <w:rPr>
           <w:rFonts w:ascii="Arial" w:hAnsi="Arial" w:cs="Arial"/>
           <w:b/>
           <w:bCs/>
-          <w:lang w:val="en-US"/>
-        </w:rPr>
-        <w:t>of</w:t>
+          <w:u w:val="single"/>
+          <w:lang w:val="en-US"/>
+        </w:rPr>
+        <w:t xml:space="preserve"> 50%</w:t>
       </w:r>
       <w:r>
         <w:rPr>
           <w:rFonts w:ascii="Arial" w:hAnsi="Arial" w:cs="Arial"/>
           <w:b/>
           <w:bCs/>
-          <w:lang w:val="en-US"/>
-        </w:rPr>
-        <w:t xml:space="preserve"> 50%</w:t>
+          <w:u w:val="single"/>
+          <w:lang w:val="en-US"/>
+        </w:rPr>
+        <w:t xml:space="preserve"> </w:t>
       </w:r>
       <w:r>
         <w:rPr>
           <w:rFonts w:ascii="Arial" w:hAnsi="Arial" w:cs="Arial"/>
           <w:b/>
           <w:bCs/>
-          <w:lang w:val="en-US"/>
-        </w:rPr>
-        <w:t xml:space="preserve"> </w:t>
+          <w:u w:val="single"/>
+          <w:lang w:val="en-US"/>
+        </w:rPr>
+        <w:t>summer effort ($</w:t>
       </w:r>
       <w:r>
         <w:rPr>
           <w:rFonts w:ascii="Arial" w:hAnsi="Arial" w:cs="Arial"/>
           <w:b/>
           <w:bCs/>
-          <w:lang w:val="en-US"/>
-        </w:rPr>
-        <w:t>summer effort</w:t>
+          <w:u w:val="single"/>
+          <w:lang w:val="en-US"/>
+        </w:rPr>
+        <w:t xml:space="preserve">3,629 </w:t>
       </w:r>
       <w:r>
         <w:rPr>
           <w:rFonts w:ascii="Arial" w:hAnsi="Arial" w:cs="Arial"/>
           <w:b/>
           <w:bCs/>
-          <w:lang w:val="en-US"/>
-        </w:rPr>
-        <w:t xml:space="preserve"> ($</w:t>
-      </w:r>
-      <w:r>
-        <w:rPr>
-          <w:rFonts w:ascii="Arial" w:hAnsi="Arial" w:cs="Arial"/>
-          <w:b/>
-          <w:bCs/>
-          <w:lang w:val="en-US"/>
-        </w:rPr>
-        <w:t>3</w:t>
-      </w:r>
-      <w:r>
-        <w:rPr>
-          <w:rFonts w:ascii="Arial" w:hAnsi="Arial" w:cs="Arial"/>
-          <w:b/>
-          <w:bCs/>
-          <w:lang w:val="en-US"/>
-        </w:rPr>
-        <w:t>,</w:t>
-      </w:r>
-      <w:r>
-        <w:rPr>
-          <w:rFonts w:ascii="Arial" w:hAnsi="Arial" w:cs="Arial"/>
-          <w:b/>
-          <w:bCs/>
-          <w:lang w:val="en-US"/>
-        </w:rPr>
-        <w:t xml:space="preserve">629 </w:t>
-      </w:r>
-      <w:r>
-        <w:rPr>
-          <w:rFonts w:ascii="Arial" w:hAnsi="Arial" w:cs="Arial"/>
-          <w:b/>
-          <w:bCs/>
+          <w:u w:val="single"/>
           <w:lang w:val="en-US"/>
         </w:rPr>
         <w:t>USD):</w:t>
@@ -5356,118 +5370,81 @@
           <w:rFonts w:ascii="Arial" w:hAnsi="Arial" w:cs="Arial"/>
           <w:b/>
           <w:bCs/>
-          <w:lang w:val="en-US"/>
-        </w:rPr>
-        <w:t xml:space="preserve">GSR </w:t>
+          <w:u w:val="single"/>
+          <w:lang w:val="en-US"/>
+        </w:rPr>
+        <w:t>GSR 3</w:t>
       </w:r>
       <w:r>
         <w:rPr>
           <w:rFonts w:ascii="Arial" w:hAnsi="Arial" w:cs="Arial"/>
           <w:b/>
           <w:bCs/>
-          <w:lang w:val="en-US"/>
-        </w:rPr>
-        <w:t>3</w:t>
+          <w:u w:val="single"/>
+          <w:vertAlign w:val="superscript"/>
+          <w:lang w:val="en-US"/>
+        </w:rPr>
+        <w:t>rd</w:t>
       </w:r>
       <w:r>
         <w:rPr>
           <w:rFonts w:ascii="Arial" w:hAnsi="Arial" w:cs="Arial"/>
           <w:b/>
           <w:bCs/>
-          <w:vertAlign w:val="superscript"/>
-          <w:lang w:val="en-US"/>
-        </w:rPr>
-        <w:t>rd</w:t>
+          <w:u w:val="single"/>
+          <w:lang w:val="en-US"/>
+        </w:rPr>
+        <w:t xml:space="preserve"> month </w:t>
       </w:r>
       <w:r>
         <w:rPr>
           <w:rFonts w:ascii="Arial" w:hAnsi="Arial" w:cs="Arial"/>
           <w:b/>
           <w:bCs/>
-          <w:lang w:val="en-US"/>
-        </w:rPr>
-        <w:t xml:space="preserve"> month </w:t>
+          <w:u w:val="single"/>
+          <w:lang w:val="en-US"/>
+        </w:rPr>
+        <w:t xml:space="preserve">of </w:t>
       </w:r>
       <w:r>
         <w:rPr>
           <w:rFonts w:ascii="Arial" w:hAnsi="Arial" w:cs="Arial"/>
           <w:b/>
           <w:bCs/>
-          <w:lang w:val="en-US"/>
-        </w:rPr>
-        <w:t xml:space="preserve">of </w:t>
+          <w:u w:val="single"/>
+          <w:lang w:val="en-US"/>
+        </w:rPr>
+        <w:t xml:space="preserve">50% </w:t>
       </w:r>
       <w:r>
         <w:rPr>
           <w:rFonts w:ascii="Arial" w:hAnsi="Arial" w:cs="Arial"/>
           <w:b/>
           <w:bCs/>
-          <w:lang w:val="en-US"/>
-        </w:rPr>
-        <w:t xml:space="preserve">50% </w:t>
+          <w:u w:val="single"/>
+          <w:lang w:val="en-US"/>
+        </w:rPr>
+        <w:t>summer effort ($</w:t>
       </w:r>
       <w:r>
         <w:rPr>
           <w:rFonts w:ascii="Arial" w:hAnsi="Arial" w:cs="Arial"/>
           <w:b/>
           <w:bCs/>
-          <w:lang w:val="en-US"/>
-        </w:rPr>
-        <w:t>summer effort</w:t>
+          <w:u w:val="single"/>
+          <w:lang w:val="en-US"/>
+        </w:rPr>
+        <w:t>3,629</w:t>
       </w:r>
       <w:r>
         <w:rPr>
           <w:rFonts w:ascii="Arial" w:hAnsi="Arial" w:cs="Arial"/>
           <w:b/>
           <w:bCs/>
-          <w:lang w:val="en-US"/>
-        </w:rPr>
-        <w:t xml:space="preserve"> ($</w:t>
-      </w:r>
-      <w:r>
-        <w:rPr>
-          <w:rFonts w:ascii="Arial" w:hAnsi="Arial" w:cs="Arial"/>
-          <w:b/>
-          <w:bCs/>
-          <w:lang w:val="en-US"/>
-        </w:rPr>
-        <w:t>3</w:t>
-      </w:r>
-      <w:r>
-        <w:rPr>
-          <w:rFonts w:ascii="Arial" w:hAnsi="Arial" w:cs="Arial"/>
-          <w:b/>
-          <w:bCs/>
-          <w:lang w:val="en-US"/>
-        </w:rPr>
-        <w:t>,</w:t>
-      </w:r>
-      <w:r>
-        <w:rPr>
-          <w:rFonts w:ascii="Arial" w:hAnsi="Arial" w:cs="Arial"/>
-          <w:b/>
-          <w:bCs/>
-          <w:lang w:val="en-US"/>
-        </w:rPr>
-        <w:t>629</w:t>
-      </w:r>
-      <w:r>
-        <w:rPr>
-          <w:rFonts w:ascii="Arial" w:hAnsi="Arial" w:cs="Arial"/>
-          <w:b/>
-          <w:bCs/>
-          <w:lang w:val="en-US"/>
-        </w:rPr>
-        <w:t xml:space="preserve"> </w:t>
-      </w:r>
-      <w:r>
-        <w:rPr>
-          <w:rFonts w:ascii="Arial" w:hAnsi="Arial" w:cs="Arial"/>
-          <w:b/>
-          <w:bCs/>
-          <w:lang w:val="en-US"/>
-        </w:rPr>
-        <w:t>USD):</w:t>
+          <w:u w:val="single"/>
+          <w:lang w:val="en-US"/>
+        </w:rPr>
+        <w:t xml:space="preserve"> USD):</w:t>
       </w:r>
       <w:r>
         <w:rPr>
@@ -5572,54 +5549,28 @@
       <w:r>
         <w:rPr>
           <w:rFonts w:ascii="Arial" w:hAnsi="Arial" w:cs="Arial"/>
+          <w:b/>
+          <w:bCs/>
           <w:u w:val="single"/>
           <w:lang w:val="en-US"/>
         </w:rPr>
-        <w:t>High Performance</w:t>
-      </w:r>
-      <w:r>
-        <w:rPr>
-          <w:rFonts w:ascii="Arial" w:hAnsi="Arial" w:cs="Arial"/>
+        <w:t>High Performance Computing Center (HPCC) subscription ($</w:t>
+      </w:r>
+      <w:r>
+        <w:rPr>
+          <w:rFonts w:ascii="Arial" w:hAnsi="Arial" w:cs="Arial"/>
+          <w:b/>
+          <w:bCs/>
           <w:u w:val="single"/>
           <w:lang w:val="en-US"/>
         </w:rPr>
-        <w:t xml:space="preserve"> Computing </w:t>
-      </w:r>
-      <w:r>
-        <w:rPr>
-          <w:rFonts w:ascii="Arial" w:hAnsi="Arial" w:cs="Arial"/>
-          <w:u w:val="single"/>
-          <w:lang w:val="en-US"/>
-        </w:rPr>
-        <w:t xml:space="preserve">Center </w:t>
-      </w:r>
-      <w:r>
-        <w:rPr>
-          <w:rFonts w:ascii="Arial" w:hAnsi="Arial" w:cs="Arial"/>
-          <w:u w:val="single"/>
-          <w:lang w:val="en-US"/>
-        </w:rPr>
-        <w:t xml:space="preserve">(HPCC) </w:t>
-      </w:r>
-      <w:r>
-        <w:rPr>
-          <w:rFonts w:ascii="Arial" w:hAnsi="Arial" w:cs="Arial"/>
-          <w:u w:val="single"/>
-          <w:lang w:val="en-US"/>
-        </w:rPr>
-        <w:t>subscription ($</w:t>
-      </w:r>
-      <w:r>
-        <w:rPr>
-          <w:rFonts w:ascii="Arial" w:hAnsi="Arial" w:cs="Arial"/>
-          <w:u w:val="single"/>
-          <w:lang w:val="en-US"/>
-        </w:rPr>
         <w:t>2</w:t>
       </w:r>
       <w:r>
         <w:rPr>
           <w:rFonts w:ascii="Arial" w:hAnsi="Arial" w:cs="Arial"/>
+          <w:b/>
+          <w:bCs/>
           <w:u w:val="single"/>
           <w:lang w:val="en-US"/>
         </w:rPr>
@@ -5784,26 +5735,12 @@
       <w:r>
         <w:rPr>
           <w:rFonts w:ascii="Arial" w:hAnsi="Arial" w:cs="Arial"/>
+          <w:b/>
+          <w:bCs/>
           <w:u w:val="single"/>
           <w:lang w:val="en-US"/>
         </w:rPr>
-        <w:t>GSR Computer Equipment ($1,</w:t>
-      </w:r>
-      <w:r>
-        <w:rPr>
-          <w:rFonts w:ascii="Arial" w:hAnsi="Arial" w:cs="Arial"/>
-          <w:u w:val="single"/>
-          <w:lang w:val="en-US"/>
-        </w:rPr>
-        <w:t>5</w:t>
-      </w:r>
-      <w:r>
-        <w:rPr>
-          <w:rFonts w:ascii="Arial" w:hAnsi="Arial" w:cs="Arial"/>
-          <w:u w:val="single"/>
-          <w:lang w:val="en-US"/>
-        </w:rPr>
-        <w:t>00 USD):</w:t>
+        <w:t>GSR Computer Equipment ($1,500 USD):</w:t>
       </w:r>
       <w:r>
         <w:rPr>
@@ -5914,7 +5851,21 @@
           <w:rFonts w:ascii="Arial" w:hAnsi="Arial" w:cs="Arial"/>
           <w:lang w:val="en-US"/>
         </w:rPr>
-        <w:t xml:space="preserve"> allocated for PI to </w:t>
+        <w:t xml:space="preserve"> allocated for PI </w:t>
+      </w:r>
+      <w:r>
+        <w:rPr>
+          <w:rFonts w:ascii="Arial" w:hAnsi="Arial" w:cs="Arial"/>
+          <w:lang w:val="en-US"/>
+        </w:rPr>
+        <w:t xml:space="preserve">and co-PI </w:t>
+      </w:r>
+      <w:r>
+        <w:rPr>
+          <w:rFonts w:ascii="Arial" w:hAnsi="Arial" w:cs="Arial"/>
+          <w:lang w:val="en-US"/>
+        </w:rPr>
+        <w:t xml:space="preserve">to </w:t>
       </w:r>
       <w:r>
         <w:rPr>
@@ -10997,6 +10948,25 @@
 </file>
 
 <file path=customXml/item1.xml><?xml version="1.0" encoding="utf-8"?>
+<b:Sources xmlns:b="http://schemas.openxmlformats.org/officeDocument/2006/bibliography" xmlns="http://schemas.openxmlformats.org/officeDocument/2006/bibliography" SelectedStyle="\APASixthEditionOfficeOnline.xsl" StyleName="APA" Version="6"/>
+</file>
+
+<file path=customXml/item2.xml><?xml version="1.0" encoding="utf-8"?>
+<?mso-contentType ?>
+<FormTemplates xmlns="http://schemas.microsoft.com/sharepoint/v3/contenttype/forms">
+  <Display>DocumentLibraryForm</Display>
+  <Edit>DocumentLibraryForm</Edit>
+  <New>DocumentLibraryForm</New>
+</FormTemplates>
+</file>
+
+<file path=customXml/item3.xml><?xml version="1.0" encoding="utf-8"?>
+<p:properties xmlns:p="http://schemas.microsoft.com/office/2006/metadata/properties" xmlns:xsi="http://www.w3.org/2001/XMLSchema-instance" xmlns:pc="http://schemas.microsoft.com/office/infopath/2007/PartnerControls">
+  <documentManagement/>
+</p:properties>
+</file>
+
+<file path=customXml/item4.xml><?xml version="1.0" encoding="utf-8"?>
 <ct:contentTypeSchema xmlns:ct="http://schemas.microsoft.com/office/2006/metadata/contentType" xmlns:ma="http://schemas.microsoft.com/office/2006/metadata/properties/metaAttributes" ct:_="" ma:_="" ma:contentTypeName="Document" ma:contentTypeID="0x0101006AB4A3C70E4F2746BB2D15934C30A828" ma:contentTypeVersion="4" ma:contentTypeDescription="Create a new document." ma:contentTypeScope="" ma:versionID="25f2047effdb520b9af0e5d7ee6088b8">
   <xsd:schema xmlns:xsd="http://www.w3.org/2001/XMLSchema" xmlns:xs="http://www.w3.org/2001/XMLSchema" xmlns:p="http://schemas.microsoft.com/office/2006/metadata/properties" xmlns:ns3="657160c4-7f50-46e1-8b07-e0962cabf281" targetNamespace="http://schemas.microsoft.com/office/2006/metadata/properties" ma:root="true" ma:fieldsID="d29120913d3ee604c92529bfe5a3a54a" ns3:_="">
     <xsd:import namespace="657160c4-7f50-46e1-8b07-e0962cabf281"/>
@@ -11140,26 +11110,32 @@
 </ct:contentTypeSchema>
 </file>
 
-<file path=customXml/item2.xml><?xml version="1.0" encoding="utf-8"?>
-<p:properties xmlns:p="http://schemas.microsoft.com/office/2006/metadata/properties" xmlns:xsi="http://www.w3.org/2001/XMLSchema-instance" xmlns:pc="http://schemas.microsoft.com/office/infopath/2007/PartnerControls">
-  <documentManagement/>
-</p:properties>
+<file path=customXml/itemProps1.xml><?xml version="1.0" encoding="utf-8"?>
+<ds:datastoreItem xmlns:ds="http://schemas.openxmlformats.org/officeDocument/2006/customXml" ds:itemID="{25C533E5-B153-415E-A7AA-E0E040FBD661}">
+  <ds:schemaRefs>
+    <ds:schemaRef ds:uri="http://schemas.openxmlformats.org/officeDocument/2006/bibliography"/>
+  </ds:schemaRefs>
+</ds:datastoreItem>
 </file>
 
-<file path=customXml/item3.xml><?xml version="1.0" encoding="utf-8"?>
-<?mso-contentType ?>
-<FormTemplates xmlns="http://schemas.microsoft.com/sharepoint/v3/contenttype/forms">
-  <Display>DocumentLibraryForm</Display>
-  <Edit>DocumentLibraryForm</Edit>
-  <New>DocumentLibraryForm</New>
-</FormTemplates>
+<file path=customXml/itemProps2.xml><?xml version="1.0" encoding="utf-8"?>
+<ds:datastoreItem xmlns:ds="http://schemas.openxmlformats.org/officeDocument/2006/customXml" ds:itemID="{E4FB1C9D-3048-4F27-BED8-81CA59BBA5E1}">
+  <ds:schemaRefs>
+    <ds:schemaRef ds:uri="http://schemas.microsoft.com/sharepoint/v3/contenttype/forms"/>
+  </ds:schemaRefs>
+</ds:datastoreItem>
 </file>
 
-<file path=customXml/item4.xml><?xml version="1.0" encoding="utf-8"?>
-<b:Sources xmlns:b="http://schemas.openxmlformats.org/officeDocument/2006/bibliography" xmlns="http://schemas.openxmlformats.org/officeDocument/2006/bibliography" SelectedStyle="\APASixthEditionOfficeOnline.xsl" StyleName="APA" Version="6"/>
+<file path=customXml/itemProps3.xml><?xml version="1.0" encoding="utf-8"?>
+<ds:datastoreItem xmlns:ds="http://schemas.openxmlformats.org/officeDocument/2006/customXml" ds:itemID="{C50DD1DC-60F9-44E1-8120-FF307487D9A2}">
+  <ds:schemaRefs>
+    <ds:schemaRef ds:uri="http://schemas.microsoft.com/office/2006/metadata/properties"/>
+    <ds:schemaRef ds:uri="http://schemas.microsoft.com/office/infopath/2007/PartnerControls"/>
+  </ds:schemaRefs>
+</ds:datastoreItem>
 </file>
 
-<file path=customXml/itemProps1.xml><?xml version="1.0" encoding="utf-8"?>
+<file path=customXml/itemProps4.xml><?xml version="1.0" encoding="utf-8"?>
 <ds:datastoreItem xmlns:ds="http://schemas.openxmlformats.org/officeDocument/2006/customXml" ds:itemID="{3D55BF3C-2117-418B-A279-D7A80001CEE4}">
   <ds:schemaRefs>
     <ds:schemaRef ds:uri="http://schemas.microsoft.com/office/2006/metadata/contentType"/>
@@ -11175,29 +11151,4 @@
     <ds:schemaRef ds:uri="http://schemas.microsoft.com/internal/obd"/>
   </ds:schemaRefs>
 </ds:datastoreItem>
-</file>
-
-<file path=customXml/itemProps2.xml><?xml version="1.0" encoding="utf-8"?>
-<ds:datastoreItem xmlns:ds="http://schemas.openxmlformats.org/officeDocument/2006/customXml" ds:itemID="{C50DD1DC-60F9-44E1-8120-FF307487D9A2}">
-  <ds:schemaRefs>
-    <ds:schemaRef ds:uri="http://schemas.microsoft.com/office/2006/metadata/properties"/>
-    <ds:schemaRef ds:uri="http://schemas.microsoft.com/office/infopath/2007/PartnerControls"/>
-  </ds:schemaRefs>
-</ds:datastoreItem>
-</file>
-
-<file path=customXml/itemProps3.xml><?xml version="1.0" encoding="utf-8"?>
-<ds:datastoreItem xmlns:ds="http://schemas.openxmlformats.org/officeDocument/2006/customXml" ds:itemID="{E4FB1C9D-3048-4F27-BED8-81CA59BBA5E1}">
-  <ds:schemaRefs>
-    <ds:schemaRef ds:uri="http://schemas.microsoft.com/sharepoint/v3/contenttype/forms"/>
-  </ds:schemaRefs>
-</ds:datastoreItem>
-</file>
-
-<file path=customXml/itemProps4.xml><?xml version="1.0" encoding="utf-8"?>
-<ds:datastoreItem xmlns:ds="http://schemas.openxmlformats.org/officeDocument/2006/customXml" ds:itemID="{25C533E5-B153-415E-A7AA-E0E040FBD661}">
-  <ds:schemaRefs>
-    <ds:schemaRef ds:uri="http://schemas.openxmlformats.org/officeDocument/2006/bibliography"/>
-  </ds:schemaRefs>
-</ds:datastoreItem>
 </file>
</xml_diff>